<commit_message>
Changes in Nota Conceptual and PDF
</commit_message>
<xml_diff>
--- a/MIC - Profesionalizante/ANEXO-1-FORMATO-NOTA-CONCEPTUAL-DOCENTE.docx
+++ b/MIC - Profesionalizante/ANEXO-1-FORMATO-NOTA-CONCEPTUAL-DOCENTE.docx
@@ -51,13 +51,20 @@
     </w:p>
     <w:p>
       <w:pPr>
-        <w:jc w:val="center"/>
         <w:rPr>
           <w:rFonts w:ascii="Arial Narrow" w:eastAsia="Times New Roman" w:hAnsi="Arial Narrow" w:cs="Times New Roman"/>
           <w:sz w:val="24"/>
           <w:szCs w:val="24"/>
         </w:rPr>
       </w:pPr>
+      <w:r>
+        <w:rPr>
+          <w:rFonts w:ascii="Arial Narrow" w:eastAsia="Times New Roman" w:hAnsi="Arial Narrow" w:cs="Times New Roman"/>
+          <w:sz w:val="24"/>
+          <w:szCs w:val="24"/>
+        </w:rPr>
+        <w:t xml:space="preserve">             </w:t>
+      </w:r>
       <w:r>
         <w:rPr>
           <w:rFonts w:ascii="Arial Narrow" w:eastAsia="Times New Roman" w:hAnsi="Arial Narrow" w:cs="Times New Roman"/>
@@ -69,9 +76,9 @@
           <w:lang w:eastAsia="es-EC"/>
         </w:rPr>
         <w:drawing>
-          <wp:inline distT="0" distB="0" distL="0" distR="0" wp14:anchorId="1DAE7014" wp14:editId="480E63A4">
-            <wp:extent cx="3352800" cy="962025"/>
-            <wp:effectExtent l="0" t="0" r="0" b="9525"/>
+          <wp:inline distT="0" distB="0" distL="0" distR="0" wp14:anchorId="1DAE7014" wp14:editId="2CB2F770">
+            <wp:extent cx="2019300" cy="579401"/>
+            <wp:effectExtent l="0" t="0" r="0" b="0"/>
             <wp:docPr id="1" name="Picture 1"/>
             <wp:cNvGraphicFramePr>
               <a:graphicFrameLocks xmlns:a="http://schemas.openxmlformats.org/drawingml/2006/main" noChangeAspect="1"/>
@@ -86,7 +93,7 @@
                     </pic:cNvPicPr>
                   </pic:nvPicPr>
                   <pic:blipFill>
-                    <a:blip r:embed="rId7">
+                    <a:blip r:embed="rId7" cstate="print">
                       <a:extLst>
                         <a:ext uri="{28A0092B-C50C-407E-A947-70E740481C1C}">
                           <a14:useLocalDpi xmlns:a14="http://schemas.microsoft.com/office/drawing/2010/main" val="0"/>
@@ -101,7 +108,97 @@
                   <pic:spPr bwMode="auto">
                     <a:xfrm>
                       <a:off x="0" y="0"/>
-                      <a:ext cx="3352800" cy="962025"/>
+                      <a:ext cx="2062244" cy="591723"/>
+                    </a:xfrm>
+                    <a:prstGeom prst="rect">
+                      <a:avLst/>
+                    </a:prstGeom>
+                    <a:noFill/>
+                    <a:ln>
+                      <a:noFill/>
+                    </a:ln>
+                  </pic:spPr>
+                </pic:pic>
+              </a:graphicData>
+            </a:graphic>
+          </wp:inline>
+        </w:drawing>
+      </w:r>
+      <w:r>
+        <w:rPr>
+          <w:rFonts w:ascii="Arial Narrow" w:eastAsia="Times New Roman" w:hAnsi="Arial Narrow" w:cs="Times New Roman"/>
+          <w:sz w:val="24"/>
+          <w:szCs w:val="24"/>
+        </w:rPr>
+        <w:t xml:space="preserve"> </w:t>
+      </w:r>
+      <w:r>
+        <w:rPr>
+          <w:noProof/>
+          <w:lang w:eastAsia="es-EC"/>
+        </w:rPr>
+        <w:tab/>
+      </w:r>
+      <w:r>
+        <w:rPr>
+          <w:noProof/>
+          <w:lang w:eastAsia="es-EC"/>
+        </w:rPr>
+        <w:tab/>
+      </w:r>
+      <w:r>
+        <w:rPr>
+          <w:noProof/>
+          <w:lang w:eastAsia="es-EC"/>
+        </w:rPr>
+        <w:tab/>
+      </w:r>
+      <w:r>
+        <w:rPr>
+          <w:noProof/>
+          <w:lang w:eastAsia="es-EC"/>
+        </w:rPr>
+        <w:tab/>
+      </w:r>
+      <w:r>
+        <w:rPr>
+          <w:noProof/>
+          <w:lang w:eastAsia="es-EC"/>
+        </w:rPr>
+        <w:drawing>
+          <wp:inline distT="0" distB="0" distL="0" distR="0" wp14:anchorId="78E3B92C" wp14:editId="43E5FEEC">
+            <wp:extent cx="705505" cy="708025"/>
+            <wp:effectExtent l="0" t="0" r="0" b="0"/>
+            <wp:docPr id="5" name="Imagen 5" descr="IngSoftware - ESPE"/>
+            <wp:cNvGraphicFramePr>
+              <a:graphicFrameLocks xmlns:a="http://schemas.openxmlformats.org/drawingml/2006/main" noChangeAspect="1"/>
+            </wp:cNvGraphicFramePr>
+            <a:graphic xmlns:a="http://schemas.openxmlformats.org/drawingml/2006/main">
+              <a:graphicData uri="http://schemas.openxmlformats.org/drawingml/2006/picture">
+                <pic:pic xmlns:pic="http://schemas.openxmlformats.org/drawingml/2006/picture">
+                  <pic:nvPicPr>
+                    <pic:cNvPr id="0" name="Picture 8" descr="IngSoftware - ESPE"/>
+                    <pic:cNvPicPr>
+                      <a:picLocks noChangeAspect="1" noChangeArrowheads="1"/>
+                    </pic:cNvPicPr>
+                  </pic:nvPicPr>
+                  <pic:blipFill>
+                    <a:blip r:embed="rId8" cstate="print">
+                      <a:extLst>
+                        <a:ext uri="{28A0092B-C50C-407E-A947-70E740481C1C}">
+                          <a14:useLocalDpi xmlns:a14="http://schemas.microsoft.com/office/drawing/2010/main" val="0"/>
+                        </a:ext>
+                      </a:extLst>
+                    </a:blip>
+                    <a:srcRect/>
+                    <a:stretch>
+                      <a:fillRect/>
+                    </a:stretch>
+                  </pic:blipFill>
+                  <pic:spPr bwMode="auto">
+                    <a:xfrm>
+                      <a:off x="0" y="0"/>
+                      <a:ext cx="744036" cy="746694"/>
                     </a:xfrm>
                     <a:prstGeom prst="rect">
                       <a:avLst/>
@@ -167,11 +264,81 @@
         <w:jc w:val="center"/>
         <w:rPr>
           <w:rFonts w:ascii="Arial Narrow" w:eastAsia="Times New Roman" w:hAnsi="Arial Narrow" w:cs="Times New Roman"/>
+          <w:sz w:val="28"/>
+          <w:szCs w:val="24"/>
+        </w:rPr>
+      </w:pPr>
+      <w:r>
+        <w:rPr>
+          <w:rFonts w:ascii="Arial Narrow" w:eastAsia="Times New Roman" w:hAnsi="Arial Narrow" w:cs="Times New Roman"/>
+          <w:b/>
+          <w:bCs/>
+          <w:color w:val="000000"/>
+          <w:sz w:val="28"/>
+          <w:szCs w:val="24"/>
+        </w:rPr>
+        <w:t> </w:t>
+      </w:r>
+    </w:p>
+    <w:p>
+      <w:pPr>
+        <w:jc w:val="center"/>
+        <w:rPr>
+          <w:rFonts w:ascii="Arial Narrow" w:eastAsia="Times New Roman" w:hAnsi="Arial Narrow" w:cs="Times New Roman"/>
+          <w:b/>
+          <w:bCs/>
+          <w:color w:val="000000"/>
+          <w:sz w:val="28"/>
+          <w:szCs w:val="24"/>
+        </w:rPr>
+      </w:pPr>
+      <w:r>
+        <w:rPr>
+          <w:rFonts w:ascii="Arial Narrow" w:eastAsia="Times New Roman" w:hAnsi="Arial Narrow" w:cs="Times New Roman"/>
+          <w:b/>
+          <w:bCs/>
+          <w:color w:val="000000"/>
+          <w:sz w:val="28"/>
+          <w:szCs w:val="24"/>
+        </w:rPr>
+        <w:t xml:space="preserve">NOTA CONCEPTUAL PARA </w:t>
+      </w:r>
+    </w:p>
+    <w:p>
+      <w:pPr>
+        <w:jc w:val="center"/>
+        <w:rPr>
+          <w:rFonts w:ascii="Arial Narrow" w:eastAsia="Times New Roman" w:hAnsi="Arial Narrow" w:cs="Times New Roman"/>
+          <w:b/>
+          <w:bCs/>
+          <w:color w:val="000000"/>
+          <w:sz w:val="28"/>
+          <w:szCs w:val="24"/>
+        </w:rPr>
+      </w:pPr>
+      <w:r>
+        <w:rPr>
+          <w:rFonts w:ascii="Arial Narrow" w:eastAsia="Times New Roman" w:hAnsi="Arial Narrow" w:cs="Times New Roman"/>
+          <w:b/>
+          <w:bCs/>
+          <w:color w:val="000000"/>
+          <w:sz w:val="28"/>
+          <w:szCs w:val="24"/>
+        </w:rPr>
+        <w:t>TRABAJO DE INTEGRACIÓN CURRICULAR</w:t>
+      </w:r>
+    </w:p>
+    <w:p>
+      <w:pPr>
+        <w:rPr>
+          <w:rFonts w:ascii="Arial Narrow" w:eastAsia="Times New Roman" w:hAnsi="Arial Narrow" w:cs="Times New Roman"/>
           <w:sz w:val="32"/>
           <w:szCs w:val="24"/>
         </w:rPr>
       </w:pPr>
-      <w:r>
+    </w:p>
+    <w:p>
+      <w:pPr>
         <w:rPr>
           <w:rFonts w:ascii="Arial Narrow" w:eastAsia="Times New Roman" w:hAnsi="Arial Narrow" w:cs="Times New Roman"/>
           <w:b/>
@@ -180,144 +347,7 @@
           <w:sz w:val="32"/>
           <w:szCs w:val="24"/>
         </w:rPr>
-        <w:t> </w:t>
-      </w:r>
-    </w:p>
-    <w:p>
-      <w:pPr>
-        <w:rPr>
-          <w:rFonts w:ascii="Arial Narrow" w:eastAsia="Times New Roman" w:hAnsi="Arial Narrow" w:cs="Times New Roman"/>
-          <w:sz w:val="32"/>
-          <w:szCs w:val="24"/>
-        </w:rPr>
-      </w:pPr>
-    </w:p>
-    <w:p>
-      <w:pPr>
-        <w:jc w:val="center"/>
-        <w:rPr>
-          <w:rFonts w:ascii="Arial Narrow" w:eastAsia="Times New Roman" w:hAnsi="Arial Narrow" w:cs="Times New Roman"/>
-          <w:b/>
-          <w:bCs/>
-          <w:color w:val="000000"/>
-          <w:sz w:val="32"/>
-          <w:szCs w:val="24"/>
-        </w:rPr>
-      </w:pPr>
-      <w:r>
-        <w:rPr>
-          <w:rFonts w:ascii="Arial Narrow" w:eastAsia="Times New Roman" w:hAnsi="Arial Narrow" w:cs="Times New Roman"/>
-          <w:b/>
-          <w:bCs/>
-          <w:color w:val="000000"/>
-          <w:sz w:val="32"/>
-          <w:szCs w:val="24"/>
-        </w:rPr>
-        <w:t xml:space="preserve">DEPARTAMENTO DE </w:t>
-      </w:r>
-      <w:r>
-        <w:rPr>
-          <w:rFonts w:ascii="Arial Narrow" w:eastAsia="Times New Roman" w:hAnsi="Arial Narrow" w:cs="Times New Roman"/>
-          <w:b/>
-          <w:bCs/>
-          <w:color w:val="000000"/>
-          <w:sz w:val="32"/>
-          <w:szCs w:val="24"/>
-        </w:rPr>
-        <w:t>CIENCIA DE LA COMPUTACIÓN</w:t>
-      </w:r>
-    </w:p>
-    <w:p>
-      <w:pPr>
-        <w:jc w:val="center"/>
-        <w:rPr>
-          <w:rFonts w:ascii="Arial Narrow" w:eastAsia="Times New Roman" w:hAnsi="Arial Narrow" w:cs="Times New Roman"/>
-          <w:sz w:val="32"/>
-          <w:szCs w:val="24"/>
-        </w:rPr>
-      </w:pPr>
-    </w:p>
-    <w:p>
-      <w:pPr>
-        <w:spacing w:after="240"/>
-        <w:rPr>
-          <w:rFonts w:ascii="Arial Narrow" w:eastAsia="Times New Roman" w:hAnsi="Arial Narrow" w:cs="Times New Roman"/>
-          <w:sz w:val="32"/>
-          <w:szCs w:val="24"/>
-        </w:rPr>
-      </w:pPr>
-    </w:p>
-    <w:p>
-      <w:pPr>
-        <w:jc w:val="center"/>
-        <w:rPr>
-          <w:rFonts w:ascii="Arial Narrow" w:eastAsia="Times New Roman" w:hAnsi="Arial Narrow" w:cs="Times New Roman"/>
-          <w:b/>
-          <w:bCs/>
-          <w:color w:val="000000"/>
-          <w:sz w:val="32"/>
-          <w:szCs w:val="24"/>
-        </w:rPr>
-      </w:pPr>
-      <w:r>
-        <w:rPr>
-          <w:rFonts w:ascii="Arial Narrow" w:eastAsia="Times New Roman" w:hAnsi="Arial Narrow" w:cs="Times New Roman"/>
-          <w:b/>
-          <w:bCs/>
-          <w:color w:val="000000"/>
-          <w:sz w:val="32"/>
-          <w:szCs w:val="24"/>
-        </w:rPr>
-        <w:t xml:space="preserve">CARRERA DE </w:t>
-      </w:r>
-      <w:r>
-        <w:rPr>
-          <w:rFonts w:ascii="Arial Narrow" w:eastAsia="Times New Roman" w:hAnsi="Arial Narrow" w:cs="Times New Roman"/>
-          <w:b/>
-          <w:bCs/>
-          <w:color w:val="000000"/>
-          <w:sz w:val="32"/>
-          <w:szCs w:val="24"/>
-        </w:rPr>
-        <w:t>SOFTWARE</w:t>
-      </w:r>
-    </w:p>
-    <w:p>
-      <w:pPr>
-        <w:jc w:val="center"/>
-        <w:rPr>
-          <w:rFonts w:ascii="Arial Narrow" w:eastAsia="Times New Roman" w:hAnsi="Arial Narrow" w:cs="Times New Roman"/>
-          <w:b/>
-          <w:bCs/>
-          <w:color w:val="000000"/>
-          <w:sz w:val="32"/>
-          <w:szCs w:val="24"/>
-        </w:rPr>
-      </w:pPr>
-    </w:p>
-    <w:p>
-      <w:pPr>
-        <w:jc w:val="center"/>
-        <w:rPr>
-          <w:rFonts w:ascii="Arial Narrow" w:eastAsia="Times New Roman" w:hAnsi="Arial Narrow" w:cs="Times New Roman"/>
-          <w:b/>
-          <w:bCs/>
-          <w:color w:val="000000"/>
-          <w:sz w:val="32"/>
-          <w:szCs w:val="24"/>
-        </w:rPr>
-      </w:pPr>
-      <w:r>
-        <w:rPr>
-          <w:rFonts w:ascii="Arial Narrow" w:eastAsia="Times New Roman" w:hAnsi="Arial Narrow" w:cs="Times New Roman"/>
-          <w:b/>
-          <w:bCs/>
-          <w:color w:val="000000"/>
-          <w:sz w:val="32"/>
-          <w:szCs w:val="24"/>
-        </w:rPr>
-        <w:t>NOTA CONCEPTUAL PARA TRABAJO DE INTEGRACIÓN CURRICULAR</w:t>
-      </w:r>
+      </w:pPr>
     </w:p>
     <w:p>
       <w:pPr>
@@ -347,6 +377,7 @@
     </w:p>
     <w:p>
       <w:pPr>
+        <w:jc w:val="both"/>
         <w:rPr>
           <w:rFonts w:ascii="Arial Narrow" w:eastAsia="Times New Roman" w:hAnsi="Arial Narrow" w:cs="Times New Roman"/>
           <w:b/>
@@ -381,26 +412,15 @@
       <w:r>
         <w:rPr>
           <w:rFonts w:ascii="Arial Narrow" w:eastAsia="Times New Roman" w:hAnsi="Arial Narrow" w:cs="Times New Roman"/>
+          <w:b/>
           <w:bCs/>
           <w:color w:val="000000"/>
           <w:sz w:val="24"/>
           <w:szCs w:val="24"/>
         </w:rPr>
-        <w:t>Desarrollo de una aplicación móvil personalizada para el seguimiento y análisis del rendimiento deportivo en fútbol amateur mediante registro estadístico individual</w:t>
+        <w:t>Prototipo funcional</w:t>
       </w:r>
       <w:r>
-        <w:rPr>
-          <w:rFonts w:ascii="Arial Narrow" w:eastAsia="Times New Roman" w:hAnsi="Arial Narrow" w:cs="Times New Roman"/>
-          <w:bCs/>
-          <w:color w:val="000000"/>
-          <w:sz w:val="24"/>
-          <w:szCs w:val="24"/>
-        </w:rPr>
-        <w:t>.</w:t>
-      </w:r>
-    </w:p>
-    <w:p>
-      <w:pPr>
         <w:rPr>
           <w:rFonts w:ascii="Arial Narrow" w:eastAsia="Times New Roman" w:hAnsi="Arial Narrow" w:cs="Times New Roman"/>
           <w:b/>
@@ -409,10 +429,60 @@
           <w:sz w:val="24"/>
           <w:szCs w:val="24"/>
         </w:rPr>
-      </w:pPr>
+        <w:t xml:space="preserve"> de una aplicación móvil personalizada para el seguimiento y análisis del rendimiento deportivo en fútbol amateur mediante registro estadístico individual.</w:t>
+      </w:r>
     </w:p>
     <w:p>
       <w:pPr>
+        <w:jc w:val="both"/>
+        <w:rPr>
+          <w:rFonts w:ascii="Arial Narrow" w:eastAsia="Times New Roman" w:hAnsi="Arial Narrow" w:cs="Times New Roman"/>
+          <w:b/>
+          <w:bCs/>
+          <w:color w:val="000000"/>
+          <w:sz w:val="24"/>
+          <w:szCs w:val="24"/>
+        </w:rPr>
+      </w:pPr>
+      <w:r>
+        <w:rPr>
+          <w:rFonts w:ascii="Arial Narrow" w:eastAsia="Times New Roman" w:hAnsi="Arial Narrow" w:cs="Times New Roman"/>
+          <w:b/>
+          <w:bCs/>
+          <w:color w:val="000000"/>
+          <w:sz w:val="24"/>
+          <w:szCs w:val="24"/>
+        </w:rPr>
+        <w:t>DEPARTAMENTO: Ciencias de la Computación</w:t>
+      </w:r>
+    </w:p>
+    <w:p>
+      <w:pPr>
+        <w:jc w:val="both"/>
+        <w:rPr>
+          <w:rFonts w:ascii="Arial Narrow" w:eastAsia="Times New Roman" w:hAnsi="Arial Narrow" w:cs="Times New Roman"/>
+          <w:b/>
+          <w:bCs/>
+          <w:color w:val="000000"/>
+          <w:sz w:val="24"/>
+          <w:szCs w:val="24"/>
+        </w:rPr>
+      </w:pPr>
+      <w:r>
+        <w:rPr>
+          <w:rFonts w:ascii="Arial Narrow" w:eastAsia="Times New Roman" w:hAnsi="Arial Narrow" w:cs="Times New Roman"/>
+          <w:b/>
+          <w:bCs/>
+          <w:color w:val="000000"/>
+          <w:sz w:val="24"/>
+          <w:szCs w:val="24"/>
+        </w:rPr>
+        <w:t>CARRERA: Ingeniería de Software</w:t>
+      </w:r>
+    </w:p>
+    <w:p>
+      <w:pPr>
+        <w:jc w:val="both"/>
         <w:rPr>
           <w:rFonts w:ascii="Arial Narrow" w:hAnsi="Arial Narrow"/>
           <w:b/>
@@ -420,10 +490,228 @@
           <w:sz w:val="24"/>
           <w:szCs w:val="24"/>
         </w:rPr>
+      </w:pPr>
+      <w:r>
+        <w:rPr>
+          <w:rFonts w:ascii="Arial Narrow" w:eastAsia="Times New Roman" w:hAnsi="Arial Narrow" w:cs="Times New Roman"/>
+          <w:b/>
+          <w:bCs/>
+          <w:color w:val="000000"/>
+          <w:sz w:val="24"/>
+          <w:szCs w:val="24"/>
+        </w:rPr>
+        <w:t>DOCENTE PROPONENTE:</w:t>
+      </w:r>
+      <w:r>
+        <w:rPr>
+          <w:rFonts w:ascii="Arial Narrow" w:eastAsia="Times New Roman" w:hAnsi="Arial Narrow" w:cs="Times New Roman"/>
+          <w:b/>
+          <w:bCs/>
+          <w:color w:val="000000"/>
+          <w:sz w:val="24"/>
+          <w:szCs w:val="24"/>
+        </w:rPr>
+        <w:t xml:space="preserve"> </w:t>
+      </w:r>
+      <w:r>
+        <w:rPr>
+          <w:rFonts w:ascii="Arial Narrow" w:hAnsi="Arial Narrow"/>
+          <w:b/>
+          <w:color w:val="000000"/>
+          <w:sz w:val="24"/>
+          <w:szCs w:val="24"/>
+        </w:rPr>
+        <w:t>Ing. Dori</w:t>
+      </w:r>
+      <w:r>
+        <w:rPr>
+          <w:rFonts w:ascii="Arial Narrow" w:hAnsi="Arial Narrow"/>
+          <w:b/>
+          <w:color w:val="000000"/>
+          <w:sz w:val="24"/>
+          <w:szCs w:val="24"/>
+        </w:rPr>
+        <w:t>s</w:t>
+      </w:r>
+      <w:r>
+        <w:rPr>
+          <w:rFonts w:ascii="Arial Narrow" w:hAnsi="Arial Narrow"/>
+          <w:b/>
+          <w:color w:val="000000"/>
+          <w:sz w:val="24"/>
+          <w:szCs w:val="24"/>
+        </w:rPr>
+        <w:t xml:space="preserve"> Karina</w:t>
+      </w:r>
+      <w:r>
+        <w:rPr>
+          <w:rFonts w:ascii="Arial Narrow" w:hAnsi="Arial Narrow"/>
+          <w:b/>
+          <w:color w:val="000000"/>
+          <w:sz w:val="24"/>
+          <w:szCs w:val="24"/>
+        </w:rPr>
+        <w:t xml:space="preserve"> </w:t>
+      </w:r>
+      <w:proofErr w:type="spellStart"/>
+      <w:r>
+        <w:rPr>
+          <w:rFonts w:ascii="Arial Narrow" w:hAnsi="Arial Narrow"/>
+          <w:b/>
+          <w:color w:val="000000"/>
+          <w:sz w:val="24"/>
+          <w:szCs w:val="24"/>
+        </w:rPr>
+        <w:t>Chicaiza</w:t>
+      </w:r>
+      <w:proofErr w:type="spellEnd"/>
+      <w:r>
+        <w:rPr>
+          <w:rFonts w:ascii="Arial Narrow" w:hAnsi="Arial Narrow"/>
+          <w:b/>
+          <w:color w:val="000000"/>
+          <w:sz w:val="24"/>
+          <w:szCs w:val="24"/>
+        </w:rPr>
+        <w:t xml:space="preserve"> </w:t>
+      </w:r>
+      <w:proofErr w:type="spellStart"/>
+      <w:r>
+        <w:rPr>
+          <w:rFonts w:ascii="Arial Narrow" w:hAnsi="Arial Narrow"/>
+          <w:b/>
+          <w:color w:val="000000"/>
+          <w:sz w:val="24"/>
+          <w:szCs w:val="24"/>
+        </w:rPr>
+        <w:t>Angamarca</w:t>
+      </w:r>
+      <w:proofErr w:type="spellEnd"/>
+      <w:r>
+        <w:rPr>
+          <w:rFonts w:ascii="Arial Narrow" w:hAnsi="Arial Narrow"/>
+          <w:b/>
+          <w:color w:val="000000"/>
+          <w:sz w:val="24"/>
+          <w:szCs w:val="24"/>
+        </w:rPr>
+        <w:t>,</w:t>
+      </w:r>
+      <w:r>
+        <w:rPr>
+          <w:rFonts w:ascii="Arial Narrow" w:hAnsi="Arial Narrow"/>
+          <w:b/>
+          <w:color w:val="000000"/>
+          <w:sz w:val="24"/>
+          <w:szCs w:val="24"/>
+        </w:rPr>
+        <w:t xml:space="preserve"> </w:t>
+      </w:r>
+      <w:proofErr w:type="spellStart"/>
+      <w:r>
+        <w:rPr>
+          <w:rFonts w:ascii="Arial Narrow" w:hAnsi="Arial Narrow"/>
+          <w:b/>
+          <w:color w:val="000000"/>
+          <w:sz w:val="24"/>
+          <w:szCs w:val="24"/>
+        </w:rPr>
+        <w:t>Mgtr</w:t>
+      </w:r>
+      <w:proofErr w:type="spellEnd"/>
+      <w:r>
+        <w:rPr>
+          <w:rFonts w:ascii="Arial Narrow" w:hAnsi="Arial Narrow"/>
+          <w:b/>
+          <w:color w:val="000000"/>
+          <w:sz w:val="24"/>
+          <w:szCs w:val="24"/>
+        </w:rPr>
+        <w:t>.</w:t>
+      </w:r>
+    </w:p>
+    <w:p>
+      <w:pPr>
+        <w:rPr>
+          <w:rFonts w:ascii="Arial Narrow" w:hAnsi="Arial Narrow"/>
+          <w:color w:val="000000"/>
+          <w:sz w:val="24"/>
+          <w:szCs w:val="24"/>
+        </w:rPr>
+      </w:pPr>
+    </w:p>
+    <w:p>
+      <w:pPr>
+        <w:jc w:val="right"/>
+        <w:rPr>
+          <w:rFonts w:ascii="Arial Narrow" w:hAnsi="Arial Narrow"/>
+          <w:b/>
+          <w:color w:val="000000"/>
+          <w:sz w:val="24"/>
+          <w:szCs w:val="24"/>
+        </w:rPr>
+      </w:pPr>
+    </w:p>
+    <w:p>
+      <w:pPr>
+        <w:jc w:val="right"/>
+        <w:rPr>
+          <w:rFonts w:ascii="Arial Narrow" w:hAnsi="Arial Narrow"/>
+          <w:b/>
+          <w:color w:val="000000"/>
+          <w:sz w:val="24"/>
+          <w:szCs w:val="24"/>
+        </w:rPr>
+      </w:pPr>
+    </w:p>
+    <w:p>
+      <w:pPr>
+        <w:jc w:val="right"/>
+        <w:rPr>
+          <w:rFonts w:ascii="Arial Narrow" w:hAnsi="Arial Narrow"/>
+          <w:b/>
+          <w:color w:val="000000"/>
+          <w:sz w:val="24"/>
+          <w:szCs w:val="24"/>
+        </w:rPr>
+      </w:pPr>
+    </w:p>
+    <w:p>
+      <w:pPr>
+        <w:jc w:val="right"/>
+        <w:rPr>
+          <w:rFonts w:ascii="Arial Narrow" w:hAnsi="Arial Narrow"/>
+          <w:b/>
+          <w:color w:val="000000"/>
+          <w:sz w:val="24"/>
+          <w:szCs w:val="24"/>
+        </w:rPr>
+      </w:pPr>
+    </w:p>
+    <w:p>
+      <w:pPr>
+        <w:jc w:val="right"/>
+        <w:rPr>
+          <w:rFonts w:ascii="Arial Narrow" w:hAnsi="Arial Narrow"/>
+          <w:b/>
+          <w:color w:val="000000"/>
+          <w:sz w:val="24"/>
+          <w:szCs w:val="24"/>
+        </w:rPr>
+      </w:pPr>
+    </w:p>
+    <w:p>
+      <w:pPr>
+        <w:jc w:val="right"/>
+        <w:rPr>
+          <w:rFonts w:ascii="Arial Narrow" w:hAnsi="Arial Narrow"/>
+          <w:color w:val="000000"/>
+          <w:sz w:val="24"/>
+          <w:szCs w:val="24"/>
+        </w:rPr>
         <w:sectPr>
-          <w:headerReference w:type="default" r:id="rId8"/>
-          <w:footerReference w:type="default" r:id="rId9"/>
-          <w:headerReference w:type="first" r:id="rId10"/>
+          <w:headerReference w:type="default" r:id="rId9"/>
+          <w:footerReference w:type="default" r:id="rId10"/>
           <w:pgSz w:w="11910" w:h="16840"/>
           <w:pgMar w:top="1417" w:right="1701" w:bottom="1417" w:left="1701" w:header="1134" w:footer="1195" w:gutter="0"/>
           <w:pgNumType w:start="1"/>
@@ -434,34 +722,35 @@
       </w:pPr>
       <w:r>
         <w:rPr>
-          <w:rFonts w:ascii="Arial Narrow" w:eastAsia="Times New Roman" w:hAnsi="Arial Narrow" w:cs="Times New Roman"/>
+          <w:rFonts w:ascii="Arial Narrow" w:hAnsi="Arial Narrow"/>
           <w:b/>
-          <w:bCs/>
           <w:color w:val="000000"/>
           <w:sz w:val="24"/>
           <w:szCs w:val="24"/>
         </w:rPr>
-        <w:t>DOCENTE PROPONENTE:</w:t>
+        <w:t xml:space="preserve">Lugar y Fecha: </w:t>
       </w:r>
+      <w:proofErr w:type="spellStart"/>
       <w:r>
         <w:rPr>
-          <w:rFonts w:ascii="Arial Narrow" w:eastAsia="Times New Roman" w:hAnsi="Arial Narrow" w:cs="Times New Roman"/>
+          <w:rFonts w:ascii="Arial Narrow" w:hAnsi="Arial Narrow"/>
           <w:b/>
-          <w:bCs/>
           <w:color w:val="000000"/>
           <w:sz w:val="24"/>
           <w:szCs w:val="24"/>
         </w:rPr>
-        <w:t xml:space="preserve"> </w:t>
+        <w:t>Sangolquí</w:t>
       </w:r>
+      <w:proofErr w:type="spellEnd"/>
       <w:r>
         <w:rPr>
           <w:rFonts w:ascii="Arial Narrow" w:hAnsi="Arial Narrow"/>
+          <w:b/>
           <w:color w:val="000000"/>
           <w:sz w:val="24"/>
           <w:szCs w:val="24"/>
         </w:rPr>
-        <w:t>Ing. Dorys Chicaiza. Mgtr.</w:t>
+        <w:t>, 22 de Mayo de 2025</w:t>
       </w:r>
     </w:p>
     <w:tbl>
@@ -569,7 +858,7 @@
                 <w:sz w:val="24"/>
                 <w:szCs w:val="24"/>
               </w:rPr>
-              <w:t>Fecha</w:t>
+              <w:t>Tema</w:t>
             </w:r>
           </w:p>
         </w:tc>
@@ -588,19 +877,41 @@
               <w:spacing w:line="276" w:lineRule="auto"/>
               <w:rPr>
                 <w:rFonts w:ascii="Arial Narrow" w:hAnsi="Arial Narrow"/>
-                <w:color w:val="000000"/>
-                <w:sz w:val="24"/>
-                <w:szCs w:val="24"/>
-              </w:rPr>
-            </w:pPr>
-            <w:r>
-              <w:rPr>
-                <w:rFonts w:ascii="Arial Narrow" w:hAnsi="Arial Narrow"/>
-                <w:color w:val="000000"/>
-                <w:sz w:val="24"/>
-                <w:szCs w:val="24"/>
-              </w:rPr>
-              <w:t>21 de Mayo de 2025</w:t>
+                <w:b/>
+                <w:color w:val="000000"/>
+                <w:sz w:val="24"/>
+                <w:szCs w:val="24"/>
+              </w:rPr>
+            </w:pPr>
+            <w:r>
+              <w:rPr>
+                <w:rFonts w:ascii="Arial Narrow" w:eastAsia="Times New Roman" w:hAnsi="Arial Narrow" w:cs="Times New Roman"/>
+                <w:bCs/>
+                <w:color w:val="000000"/>
+                <w:sz w:val="24"/>
+                <w:szCs w:val="24"/>
+              </w:rPr>
+              <w:t>Prototipo funcional</w:t>
+            </w:r>
+            <w:r>
+              <w:rPr>
+                <w:rFonts w:ascii="Arial Narrow" w:eastAsia="Times New Roman" w:hAnsi="Arial Narrow" w:cs="Times New Roman"/>
+                <w:bCs/>
+                <w:color w:val="000000"/>
+                <w:sz w:val="24"/>
+                <w:szCs w:val="24"/>
+              </w:rPr>
+              <w:t xml:space="preserve"> de una aplicación móvil personalizada para el seguimiento y análisis del rendimiento deportivo en fútbol amateur mediante registro estadístico individual</w:t>
+            </w:r>
+            <w:r>
+              <w:rPr>
+                <w:rFonts w:ascii="Arial Narrow" w:eastAsia="Times New Roman" w:hAnsi="Arial Narrow" w:cs="Times New Roman"/>
+                <w:bCs/>
+                <w:color w:val="000000"/>
+                <w:sz w:val="24"/>
+                <w:szCs w:val="24"/>
+              </w:rPr>
+              <w:t>.</w:t>
             </w:r>
           </w:p>
         </w:tc>
@@ -635,7 +946,7 @@
                 <w:sz w:val="24"/>
                 <w:szCs w:val="24"/>
               </w:rPr>
-              <w:t>Tema</w:t>
+              <w:t>Línea de investigación</w:t>
             </w:r>
           </w:p>
         </w:tc>
@@ -654,31 +965,28 @@
               <w:spacing w:line="276" w:lineRule="auto"/>
               <w:rPr>
                 <w:rFonts w:ascii="Arial Narrow" w:hAnsi="Arial Narrow"/>
-                <w:b/>
-                <w:color w:val="000000"/>
-                <w:sz w:val="24"/>
-                <w:szCs w:val="24"/>
-              </w:rPr>
-            </w:pPr>
-            <w:r>
-              <w:rPr>
-                <w:rFonts w:ascii="Arial Narrow" w:eastAsia="Times New Roman" w:hAnsi="Arial Narrow" w:cs="Times New Roman"/>
-                <w:bCs/>
-                <w:color w:val="000000"/>
-                <w:sz w:val="24"/>
-                <w:szCs w:val="24"/>
-              </w:rPr>
-              <w:t>Desarrollo de una aplicación móvil personalizada para el seguimiento y análisis del rendimiento deportivo en fútbol amateur mediante registro estadístico individual</w:t>
-            </w:r>
-            <w:r>
-              <w:rPr>
-                <w:rFonts w:ascii="Arial Narrow" w:eastAsia="Times New Roman" w:hAnsi="Arial Narrow" w:cs="Times New Roman"/>
-                <w:bCs/>
-                <w:color w:val="000000"/>
-                <w:sz w:val="24"/>
-                <w:szCs w:val="24"/>
-              </w:rPr>
-              <w:t>.</w:t>
+                <w:color w:val="000000"/>
+                <w:sz w:val="24"/>
+                <w:szCs w:val="24"/>
+              </w:rPr>
+            </w:pPr>
+            <w:r>
+              <w:rPr>
+                <w:rFonts w:ascii="Arial Narrow" w:hAnsi="Arial Narrow"/>
+                <w:color w:val="000000"/>
+                <w:sz w:val="24"/>
+                <w:szCs w:val="24"/>
+              </w:rPr>
+              <w:t>Tecnologías de Información y Comunicación</w:t>
+            </w:r>
+            <w:r>
+              <w:rPr>
+                <w:rFonts w:ascii="Arial Narrow" w:hAnsi="Arial Narrow"/>
+                <w:color w:val="000000"/>
+                <w:sz w:val="24"/>
+                <w:szCs w:val="24"/>
+              </w:rPr>
+              <w:t>, Ingeniería de Software</w:t>
             </w:r>
           </w:p>
         </w:tc>
@@ -713,7 +1021,7 @@
                 <w:sz w:val="24"/>
                 <w:szCs w:val="24"/>
               </w:rPr>
-              <w:t>Línea de investigación</w:t>
+              <w:t xml:space="preserve">Número de estudiantes participantes </w:t>
             </w:r>
           </w:p>
         </w:tc>
@@ -744,7 +1052,7 @@
                 <w:sz w:val="24"/>
                 <w:szCs w:val="24"/>
               </w:rPr>
-              <w:t>Tecnologías de Información y Comunicación</w:t>
+              <w:t>2</w:t>
             </w:r>
           </w:p>
         </w:tc>
@@ -779,7 +1087,7 @@
                 <w:sz w:val="24"/>
                 <w:szCs w:val="24"/>
               </w:rPr>
-              <w:t xml:space="preserve">Número de estudiantes participantes </w:t>
+              <w:t>Carrera</w:t>
             </w:r>
           </w:p>
         </w:tc>
@@ -810,65 +1118,8 @@
                 <w:sz w:val="24"/>
                 <w:szCs w:val="24"/>
               </w:rPr>
-              <w:t>2</w:t>
-            </w:r>
-          </w:p>
-        </w:tc>
-      </w:tr>
-      <w:tr>
-        <w:tc>
-          <w:tcPr>
-            <w:tcW w:w="3539" w:type="dxa"/>
-            <w:tcBorders>
-              <w:top w:val="dotted" w:sz="4" w:space="0" w:color="000000"/>
-              <w:left w:val="dotted" w:sz="4" w:space="0" w:color="000000"/>
-              <w:bottom w:val="dotted" w:sz="4" w:space="0" w:color="000000"/>
-              <w:right w:val="dotted" w:sz="4" w:space="0" w:color="000000"/>
-            </w:tcBorders>
-          </w:tcPr>
-          <w:p>
-            <w:pPr>
-              <w:spacing w:line="276" w:lineRule="auto"/>
-              <w:rPr>
-                <w:rFonts w:ascii="Arial Narrow" w:hAnsi="Arial Narrow"/>
-                <w:b/>
-                <w:color w:val="000000"/>
-                <w:sz w:val="24"/>
-                <w:szCs w:val="24"/>
-              </w:rPr>
-            </w:pPr>
-            <w:r>
-              <w:rPr>
-                <w:rFonts w:ascii="Arial Narrow" w:hAnsi="Arial Narrow"/>
-                <w:b/>
-                <w:color w:val="000000"/>
-                <w:sz w:val="24"/>
-                <w:szCs w:val="24"/>
-              </w:rPr>
-              <w:t>Carrera</w:t>
-            </w:r>
-          </w:p>
-        </w:tc>
-        <w:tc>
-          <w:tcPr>
-            <w:tcW w:w="4959" w:type="dxa"/>
-            <w:tcBorders>
-              <w:top w:val="dotted" w:sz="4" w:space="0" w:color="000000"/>
-              <w:left w:val="dotted" w:sz="4" w:space="0" w:color="000000"/>
-              <w:bottom w:val="dotted" w:sz="4" w:space="0" w:color="000000"/>
-              <w:right w:val="dotted" w:sz="4" w:space="0" w:color="000000"/>
-            </w:tcBorders>
-          </w:tcPr>
-          <w:p>
-            <w:pPr>
-              <w:spacing w:line="276" w:lineRule="auto"/>
-              <w:rPr>
-                <w:rFonts w:ascii="Arial Narrow" w:hAnsi="Arial Narrow"/>
-                <w:color w:val="000000"/>
-                <w:sz w:val="24"/>
-                <w:szCs w:val="24"/>
-              </w:rPr>
-            </w:pPr>
+              <w:t xml:space="preserve">Ingeniería de </w:t>
+            </w:r>
             <w:r>
               <w:rPr>
                 <w:rFonts w:ascii="Arial Narrow" w:hAnsi="Arial Narrow"/>
@@ -1070,12 +1321,51 @@
               <w:spacing w:line="276" w:lineRule="auto"/>
               <w:rPr>
                 <w:rFonts w:ascii="Arial Narrow" w:hAnsi="Arial Narrow"/>
-                <w:b/>
-                <w:color w:val="000000"/>
-                <w:sz w:val="24"/>
-                <w:szCs w:val="24"/>
-              </w:rPr>
-            </w:pPr>
+                <w:color w:val="000000"/>
+                <w:sz w:val="24"/>
+                <w:szCs w:val="24"/>
+              </w:rPr>
+            </w:pPr>
+            <w:proofErr w:type="spellStart"/>
+            <w:r>
+              <w:rPr>
+                <w:rFonts w:ascii="Arial Narrow" w:hAnsi="Arial Narrow"/>
+                <w:color w:val="000000"/>
+                <w:sz w:val="24"/>
+                <w:szCs w:val="24"/>
+              </w:rPr>
+              <w:t>Chicaiza</w:t>
+            </w:r>
+            <w:proofErr w:type="spellEnd"/>
+            <w:r>
+              <w:rPr>
+                <w:rFonts w:ascii="Arial Narrow" w:hAnsi="Arial Narrow"/>
+                <w:color w:val="000000"/>
+                <w:sz w:val="24"/>
+                <w:szCs w:val="24"/>
+              </w:rPr>
+              <w:t xml:space="preserve"> </w:t>
+            </w:r>
+            <w:proofErr w:type="spellStart"/>
+            <w:r>
+              <w:rPr>
+                <w:rFonts w:ascii="Arial Narrow" w:hAnsi="Arial Narrow"/>
+                <w:color w:val="000000"/>
+                <w:sz w:val="24"/>
+                <w:szCs w:val="24"/>
+              </w:rPr>
+              <w:t>Angamarca</w:t>
+            </w:r>
+            <w:proofErr w:type="spellEnd"/>
+            <w:r>
+              <w:rPr>
+                <w:rFonts w:ascii="Arial Narrow" w:hAnsi="Arial Narrow"/>
+                <w:color w:val="000000"/>
+                <w:sz w:val="24"/>
+                <w:szCs w:val="24"/>
+              </w:rPr>
+              <w:t xml:space="preserve"> Doris Karina</w:t>
+            </w:r>
           </w:p>
         </w:tc>
       </w:tr>
@@ -1128,12 +1418,20 @@
               <w:spacing w:line="276" w:lineRule="auto"/>
               <w:rPr>
                 <w:rFonts w:ascii="Arial Narrow" w:hAnsi="Arial Narrow"/>
-                <w:b/>
-                <w:color w:val="000000"/>
-                <w:sz w:val="24"/>
-                <w:szCs w:val="24"/>
-              </w:rPr>
-            </w:pPr>
+                <w:color w:val="000000"/>
+                <w:sz w:val="24"/>
+                <w:szCs w:val="24"/>
+              </w:rPr>
+            </w:pPr>
+            <w:r>
+              <w:rPr>
+                <w:rFonts w:ascii="Arial Narrow" w:hAnsi="Arial Narrow"/>
+                <w:color w:val="000000"/>
+                <w:sz w:val="24"/>
+                <w:szCs w:val="24"/>
+              </w:rPr>
+              <w:t>0502986508</w:t>
+            </w:r>
           </w:p>
         </w:tc>
       </w:tr>
@@ -1186,12 +1484,20 @@
               <w:spacing w:line="276" w:lineRule="auto"/>
               <w:rPr>
                 <w:rFonts w:ascii="Arial Narrow" w:hAnsi="Arial Narrow"/>
-                <w:b/>
-                <w:color w:val="000000"/>
-                <w:sz w:val="24"/>
-                <w:szCs w:val="24"/>
-              </w:rPr>
-            </w:pPr>
+                <w:color w:val="000000"/>
+                <w:sz w:val="24"/>
+                <w:szCs w:val="24"/>
+              </w:rPr>
+            </w:pPr>
+            <w:r>
+              <w:rPr>
+                <w:rFonts w:ascii="Arial Narrow" w:hAnsi="Arial Narrow"/>
+                <w:color w:val="000000"/>
+                <w:sz w:val="24"/>
+                <w:szCs w:val="24"/>
+              </w:rPr>
+              <w:t>L00071461</w:t>
+            </w:r>
           </w:p>
         </w:tc>
       </w:tr>
@@ -1244,12 +1550,20 @@
               <w:spacing w:line="276" w:lineRule="auto"/>
               <w:rPr>
                 <w:rFonts w:ascii="Arial Narrow" w:hAnsi="Arial Narrow"/>
-                <w:b/>
-                <w:color w:val="000000"/>
-                <w:sz w:val="24"/>
-                <w:szCs w:val="24"/>
-              </w:rPr>
-            </w:pPr>
+                <w:color w:val="000000"/>
+                <w:sz w:val="24"/>
+                <w:szCs w:val="24"/>
+              </w:rPr>
+            </w:pPr>
+            <w:r>
+              <w:rPr>
+                <w:rFonts w:ascii="Arial Narrow" w:hAnsi="Arial Narrow"/>
+                <w:color w:val="000000"/>
+                <w:sz w:val="24"/>
+                <w:szCs w:val="24"/>
+              </w:rPr>
+              <w:t>dkchicaiza@espe.edu.ec</w:t>
+            </w:r>
           </w:p>
         </w:tc>
       </w:tr>
@@ -1302,12 +1616,20 @@
               <w:spacing w:line="276" w:lineRule="auto"/>
               <w:rPr>
                 <w:rFonts w:ascii="Arial Narrow" w:hAnsi="Arial Narrow"/>
-                <w:b/>
-                <w:color w:val="000000"/>
-                <w:sz w:val="24"/>
-                <w:szCs w:val="24"/>
-              </w:rPr>
-            </w:pPr>
+                <w:color w:val="000000"/>
+                <w:sz w:val="24"/>
+                <w:szCs w:val="24"/>
+              </w:rPr>
+            </w:pPr>
+            <w:r>
+              <w:rPr>
+                <w:rFonts w:ascii="Arial Narrow" w:hAnsi="Arial Narrow"/>
+                <w:color w:val="000000"/>
+                <w:sz w:val="24"/>
+                <w:szCs w:val="24"/>
+              </w:rPr>
+              <w:t>0997835381</w:t>
+            </w:r>
           </w:p>
         </w:tc>
       </w:tr>
@@ -1380,7 +1702,29 @@
                 <w:sz w:val="24"/>
                 <w:szCs w:val="24"/>
               </w:rPr>
-              <w:t xml:space="preserve">3.- Datos generales de la Entidad co-participante(si fuese el caso) </w:t>
+              <w:t xml:space="preserve">3.- Datos generales de la Entidad </w:t>
+            </w:r>
+            <w:proofErr w:type="spellStart"/>
+            <w:r>
+              <w:rPr>
+                <w:rFonts w:ascii="Arial Narrow" w:hAnsi="Arial Narrow"/>
+                <w:b/>
+                <w:color w:val="000000"/>
+                <w:sz w:val="24"/>
+                <w:szCs w:val="24"/>
+              </w:rPr>
+              <w:t>co</w:t>
+            </w:r>
+            <w:proofErr w:type="spellEnd"/>
+            <w:r>
+              <w:rPr>
+                <w:rFonts w:ascii="Arial Narrow" w:hAnsi="Arial Narrow"/>
+                <w:b/>
+                <w:color w:val="000000"/>
+                <w:sz w:val="24"/>
+                <w:szCs w:val="24"/>
+              </w:rPr>
+              <w:t xml:space="preserve">-participante(si fuese el caso) </w:t>
             </w:r>
           </w:p>
         </w:tc>
@@ -2857,7 +3201,27 @@
                 <w:sz w:val="24"/>
                 <w:szCs w:val="24"/>
               </w:rPr>
-              <w:t>Planificar el desarrollo mediante la definición de historias de usuario y backlog del producto.</w:t>
+              <w:t xml:space="preserve">Planificar el desarrollo mediante la definición de historias de usuario y </w:t>
+            </w:r>
+            <w:proofErr w:type="spellStart"/>
+            <w:r>
+              <w:rPr>
+                <w:rFonts w:ascii="Arial Narrow" w:hAnsi="Arial Narrow"/>
+                <w:color w:val="000000"/>
+                <w:sz w:val="24"/>
+                <w:szCs w:val="24"/>
+              </w:rPr>
+              <w:t>backlog</w:t>
+            </w:r>
+            <w:proofErr w:type="spellEnd"/>
+            <w:r>
+              <w:rPr>
+                <w:rFonts w:ascii="Arial Narrow" w:hAnsi="Arial Narrow"/>
+                <w:color w:val="000000"/>
+                <w:sz w:val="24"/>
+                <w:szCs w:val="24"/>
+              </w:rPr>
+              <w:t xml:space="preserve"> del producto.</w:t>
             </w:r>
           </w:p>
         </w:tc>
@@ -3497,19 +3861,7 @@
                 <w:sz w:val="24"/>
                 <w:szCs w:val="24"/>
               </w:rPr>
-              <w:t xml:space="preserve"> a cargo de una persona diferente al proponente, el responsable deberá firmar la aceptación cor</w:t>
-            </w:r>
-            <w:bookmarkStart w:id="0" w:name="_GoBack"/>
-            <w:bookmarkEnd w:id="0"/>
-            <w:r>
-              <w:rPr>
-                <w:rFonts w:ascii="Arial Narrow" w:hAnsi="Arial Narrow"/>
-                <w:bCs/>
-                <w:color w:val="000000"/>
-                <w:sz w:val="24"/>
-                <w:szCs w:val="24"/>
-              </w:rPr>
-              <w:t xml:space="preserve">respondiente. </w:t>
+              <w:t xml:space="preserve"> a cargo de una persona diferente al proponente, el responsable deberá firmar la aceptación correspondiente. </w:t>
             </w:r>
           </w:p>
         </w:tc>
@@ -3544,43 +3896,6 @@
                 <w:szCs w:val="24"/>
               </w:rPr>
               <w:t xml:space="preserve">Nombre y firma de aceptación del responsable </w:t>
-            </w:r>
-          </w:p>
-        </w:tc>
-      </w:tr>
-      <w:tr>
-        <w:tc>
-          <w:tcPr>
-            <w:tcW w:w="8498" w:type="dxa"/>
-            <w:gridSpan w:val="3"/>
-            <w:tcBorders>
-              <w:top w:val="dotted" w:sz="4" w:space="0" w:color="000000"/>
-              <w:left w:val="dotted" w:sz="4" w:space="0" w:color="000000"/>
-              <w:bottom w:val="dotted" w:sz="4" w:space="0" w:color="000000"/>
-              <w:right w:val="dotted" w:sz="4" w:space="0" w:color="000000"/>
-            </w:tcBorders>
-          </w:tcPr>
-          <w:p>
-            <w:pPr>
-              <w:spacing w:after="0" w:line="276" w:lineRule="auto"/>
-              <w:jc w:val="center"/>
-              <w:rPr>
-                <w:rFonts w:ascii="Arial Narrow" w:hAnsi="Arial Narrow"/>
-                <w:bCs/>
-                <w:color w:val="000000"/>
-                <w:sz w:val="24"/>
-                <w:szCs w:val="24"/>
-              </w:rPr>
-            </w:pPr>
-            <w:r>
-              <w:rPr>
-                <w:rFonts w:ascii="Arial Narrow" w:hAnsi="Arial Narrow"/>
-                <w:bCs/>
-                <w:color w:val="000000"/>
-                <w:sz w:val="24"/>
-                <w:szCs w:val="24"/>
-              </w:rPr>
-              <w:t xml:space="preserve">Incluya o elimine filas según requiera </w:t>
             </w:r>
           </w:p>
         </w:tc>
@@ -3712,8 +4027,13 @@
           </w:tcPr>
           <w:p>
             <w:pPr>
+              <w:pStyle w:val="Prrafodelista"/>
+              <w:numPr>
+                <w:ilvl w:val="0"/>
+                <w:numId w:val="20"/>
+              </w:numPr>
               <w:spacing w:after="0" w:line="276" w:lineRule="auto"/>
-              <w:jc w:val="center"/>
+              <w:jc w:val="both"/>
               <w:rPr>
                 <w:rFonts w:ascii="Arial Narrow" w:hAnsi="Arial Narrow"/>
                 <w:bCs/>
@@ -3730,13 +4050,18 @@
                 <w:sz w:val="24"/>
                 <w:szCs w:val="24"/>
               </w:rPr>
-              <w:t xml:space="preserve">Ejemplos: Datos experimentales, base de datos, gráficas estadísticas, cualquier otro con fundamento científico </w:t>
-            </w:r>
-          </w:p>
-          <w:p>
-            <w:pPr>
+              <w:t xml:space="preserve">Prototipo de Aplicación móvil funcional, orientada al registro, seguimiento y análisis del rendimiento deportivo en futbolistas amateurs. </w:t>
+            </w:r>
+          </w:p>
+          <w:p>
+            <w:pPr>
+              <w:pStyle w:val="Prrafodelista"/>
+              <w:numPr>
+                <w:ilvl w:val="0"/>
+                <w:numId w:val="20"/>
+              </w:numPr>
               <w:spacing w:after="0" w:line="276" w:lineRule="auto"/>
-              <w:jc w:val="center"/>
+              <w:jc w:val="both"/>
               <w:rPr>
                 <w:rFonts w:ascii="Arial Narrow" w:hAnsi="Arial Narrow"/>
                 <w:bCs/>
@@ -3745,99 +4070,31 @@
                 <w:szCs w:val="24"/>
               </w:rPr>
             </w:pPr>
+            <w:r>
+              <w:rPr>
+                <w:rFonts w:ascii="Arial Narrow" w:hAnsi="Arial Narrow"/>
+                <w:bCs/>
+                <w:color w:val="000000"/>
+                <w:sz w:val="24"/>
+                <w:szCs w:val="24"/>
+              </w:rPr>
+              <w:t>Reporte</w:t>
+            </w:r>
+            <w:r>
+              <w:rPr>
+                <w:rFonts w:ascii="Arial Narrow" w:hAnsi="Arial Narrow"/>
+                <w:bCs/>
+                <w:color w:val="000000"/>
+                <w:sz w:val="24"/>
+                <w:szCs w:val="24"/>
+              </w:rPr>
+              <w:t xml:space="preserve"> de uso por parte de usuarios finales, que recopile la experiencia de futbolistas amateurs al interactuar con la aplicación, incluyendo observaciones sobre su uso en contextos reales y sugerencias para mejoras futuras.</w:t>
+            </w:r>
           </w:p>
           <w:p>
             <w:pPr>
               <w:spacing w:after="0" w:line="276" w:lineRule="auto"/>
-              <w:jc w:val="center"/>
-              <w:rPr>
-                <w:rFonts w:ascii="Arial Narrow" w:hAnsi="Arial Narrow"/>
-                <w:bCs/>
-                <w:color w:val="000000"/>
-                <w:sz w:val="24"/>
-                <w:szCs w:val="24"/>
-              </w:rPr>
-            </w:pPr>
-          </w:p>
-          <w:p>
-            <w:pPr>
-              <w:spacing w:after="0" w:line="276" w:lineRule="auto"/>
-              <w:jc w:val="center"/>
-              <w:rPr>
-                <w:rFonts w:ascii="Arial Narrow" w:hAnsi="Arial Narrow"/>
-                <w:bCs/>
-                <w:color w:val="000000"/>
-                <w:sz w:val="24"/>
-                <w:szCs w:val="24"/>
-              </w:rPr>
-            </w:pPr>
-          </w:p>
-        </w:tc>
-      </w:tr>
-      <w:tr>
-        <w:tc>
-          <w:tcPr>
-            <w:tcW w:w="8498" w:type="dxa"/>
-            <w:tcBorders>
-              <w:top w:val="dotted" w:sz="4" w:space="0" w:color="000000"/>
-              <w:left w:val="dotted" w:sz="4" w:space="0" w:color="000000"/>
-              <w:bottom w:val="dotted" w:sz="4" w:space="0" w:color="000000"/>
-              <w:right w:val="dotted" w:sz="4" w:space="0" w:color="000000"/>
-            </w:tcBorders>
-          </w:tcPr>
-          <w:p>
-            <w:pPr>
-              <w:spacing w:after="0" w:line="276" w:lineRule="auto"/>
-              <w:jc w:val="center"/>
-              <w:rPr>
-                <w:rFonts w:ascii="Arial Narrow" w:hAnsi="Arial Narrow"/>
-                <w:bCs/>
-                <w:color w:val="000000"/>
-                <w:sz w:val="24"/>
-                <w:szCs w:val="24"/>
-              </w:rPr>
-            </w:pPr>
-            <w:r>
-              <w:rPr>
-                <w:rFonts w:ascii="Arial Narrow" w:hAnsi="Arial Narrow"/>
-                <w:bCs/>
-                <w:color w:val="000000"/>
-                <w:sz w:val="24"/>
-                <w:szCs w:val="24"/>
-              </w:rPr>
-              <w:t>Tesis, Prototipo de Aplicación Móvil.</w:t>
-            </w:r>
-          </w:p>
-          <w:p>
-            <w:pPr>
-              <w:spacing w:after="0" w:line="276" w:lineRule="auto"/>
-              <w:jc w:val="center"/>
-              <w:rPr>
-                <w:rFonts w:ascii="Arial Narrow" w:hAnsi="Arial Narrow"/>
-                <w:bCs/>
-                <w:color w:val="000000"/>
-                <w:sz w:val="24"/>
-                <w:szCs w:val="24"/>
-              </w:rPr>
-            </w:pPr>
-          </w:p>
-          <w:p>
-            <w:pPr>
-              <w:spacing w:after="0" w:line="276" w:lineRule="auto"/>
-              <w:jc w:val="center"/>
-              <w:rPr>
-                <w:rFonts w:ascii="Arial Narrow" w:hAnsi="Arial Narrow"/>
-                <w:bCs/>
-                <w:color w:val="000000"/>
-                <w:sz w:val="24"/>
-                <w:szCs w:val="24"/>
-              </w:rPr>
-            </w:pPr>
-          </w:p>
-          <w:p>
-            <w:pPr>
-              <w:spacing w:after="0" w:line="276" w:lineRule="auto"/>
-              <w:jc w:val="center"/>
+              <w:jc w:val="both"/>
               <w:rPr>
                 <w:rFonts w:ascii="Arial Narrow" w:hAnsi="Arial Narrow"/>
                 <w:bCs/>
@@ -3957,8 +4214,30 @@
           <w:sz w:val="24"/>
           <w:szCs w:val="24"/>
         </w:rPr>
-        <w:t>: de Mayo de 2025</w:t>
+        <w:t xml:space="preserve">: </w:t>
       </w:r>
+      <w:r>
+        <w:rPr>
+          <w:rFonts w:ascii="Arial Narrow" w:hAnsi="Arial Narrow"/>
+          <w:b/>
+          <w:color w:val="000000"/>
+          <w:sz w:val="24"/>
+          <w:szCs w:val="24"/>
+        </w:rPr>
+        <w:t xml:space="preserve">22 </w:t>
+      </w:r>
+      <w:r>
+        <w:rPr>
+          <w:rFonts w:ascii="Arial Narrow" w:hAnsi="Arial Narrow"/>
+          <w:b/>
+          <w:color w:val="000000"/>
+          <w:sz w:val="24"/>
+          <w:szCs w:val="24"/>
+        </w:rPr>
+        <w:t>de Mayo de 2025</w:t>
+      </w:r>
+      <w:bookmarkStart w:id="0" w:name="_GoBack"/>
+      <w:bookmarkEnd w:id="0"/>
     </w:p>
     <w:p>
       <w:pPr>
@@ -4092,7 +4371,20 @@
     <w:pPr>
       <w:pStyle w:val="NormalWeb"/>
       <w:spacing w:before="0" w:beforeAutospacing="0" w:after="0" w:afterAutospacing="0"/>
-      <w:jc w:val="center"/>
+      <w:jc w:val="right"/>
+      <w:rPr>
+        <w:rFonts w:ascii="Arial Narrow" w:hAnsi="Arial Narrow"/>
+        <w:color w:val="1A1A1A"/>
+        <w:sz w:val="14"/>
+        <w:szCs w:val="14"/>
+      </w:rPr>
+    </w:pPr>
+  </w:p>
+  <w:p>
+    <w:pPr>
+      <w:pStyle w:val="NormalWeb"/>
+      <w:spacing w:before="0" w:beforeAutospacing="0" w:after="0" w:afterAutospacing="0"/>
+      <w:jc w:val="right"/>
       <w:rPr>
         <w:rFonts w:ascii="Arial Narrow" w:hAnsi="Arial Narrow"/>
         <w:color w:val="1A1A1A"/>
@@ -4146,96 +4438,6 @@
         <w:szCs w:val="14"/>
       </w:rPr>
       <w:fldChar w:fldCharType="end"/>
-    </w:r>
-  </w:p>
-  <w:p>
-    <w:pPr>
-      <w:pStyle w:val="NormalWeb"/>
-      <w:spacing w:before="0" w:beforeAutospacing="0" w:after="0" w:afterAutospacing="0"/>
-      <w:rPr>
-        <w:sz w:val="14"/>
-        <w:szCs w:val="14"/>
-      </w:rPr>
-    </w:pPr>
-    <w:r>
-      <w:rPr>
-        <w:rFonts w:ascii="Arial Narrow" w:hAnsi="Arial Narrow"/>
-        <w:color w:val="1A1A1A"/>
-        <w:sz w:val="14"/>
-        <w:szCs w:val="14"/>
-      </w:rPr>
-      <w:t xml:space="preserve">Código de documento:  </w:t>
-    </w:r>
-    <w:r>
-      <w:rPr>
-        <w:rFonts w:ascii="Arial Narrow" w:hAnsi="Arial Narrow"/>
-        <w:sz w:val="14"/>
-        <w:szCs w:val="14"/>
-      </w:rPr>
-      <w:t>UDED-FOR-V2-2024-003</w:t>
-    </w:r>
-    <w:r>
-      <w:rPr>
-        <w:rFonts w:ascii="Arial Narrow" w:hAnsi="Arial Narrow"/>
-        <w:color w:val="1A1A1A"/>
-        <w:sz w:val="14"/>
-        <w:szCs w:val="14"/>
-      </w:rPr>
-      <w:t xml:space="preserve">                                                                                                               </w:t>
-    </w:r>
-    <w:r>
-      <w:rPr>
-        <w:rFonts w:ascii="Arial Narrow" w:hAnsi="Arial Narrow"/>
-        <w:color w:val="1A1A1A"/>
-        <w:sz w:val="14"/>
-        <w:szCs w:val="14"/>
-      </w:rPr>
-      <w:t xml:space="preserve">                        </w:t>
-    </w:r>
-    <w:r>
-      <w:rPr>
-        <w:rFonts w:ascii="Arial Narrow" w:hAnsi="Arial Narrow"/>
-        <w:color w:val="1A1A1A"/>
-        <w:sz w:val="14"/>
-        <w:szCs w:val="14"/>
-      </w:rPr>
-      <w:t xml:space="preserve">      Rev. UPDI: 202</w:t>
-    </w:r>
-    <w:r>
-      <w:rPr>
-        <w:rFonts w:ascii="Arial Narrow" w:hAnsi="Arial Narrow"/>
-        <w:color w:val="1A1A1A"/>
-        <w:sz w:val="14"/>
-        <w:szCs w:val="14"/>
-      </w:rPr>
-      <w:t>4-mar-04</w:t>
-    </w:r>
-  </w:p>
-  <w:p>
-    <w:pPr>
-      <w:pStyle w:val="NormalWeb"/>
-      <w:spacing w:before="0" w:beforeAutospacing="0" w:after="0" w:afterAutospacing="0"/>
-      <w:rPr>
-        <w:sz w:val="14"/>
-        <w:szCs w:val="14"/>
-      </w:rPr>
-    </w:pPr>
-    <w:r>
-      <w:rPr>
-        <w:rFonts w:ascii="Arial Narrow" w:hAnsi="Arial Narrow"/>
-        <w:color w:val="1A1A1A"/>
-        <w:sz w:val="14"/>
-        <w:szCs w:val="14"/>
-      </w:rPr>
-      <w:t xml:space="preserve">Código de proceso: </w:t>
-    </w:r>
-    <w:r>
-      <w:rPr>
-        <w:rFonts w:ascii="Arial Narrow" w:hAnsi="Arial Narrow"/>
-        <w:sz w:val="14"/>
-        <w:szCs w:val="14"/>
-      </w:rPr>
-      <w:t>GDOC-ATAD-5-3</w:t>
     </w:r>
   </w:p>
   <w:p>
@@ -4255,42 +4457,6 @@
         <w:szCs w:val="14"/>
       </w:rPr>
     </w:pPr>
-    <w:r>
-      <w:rPr>
-        <w:sz w:val="14"/>
-        <w:szCs w:val="14"/>
-      </w:rPr>
-      <w:fldChar w:fldCharType="begin"/>
-    </w:r>
-    <w:r>
-      <w:rPr>
-        <w:sz w:val="14"/>
-        <w:szCs w:val="14"/>
-      </w:rPr>
-      <w:instrText>PAGE</w:instrText>
-    </w:r>
-    <w:r>
-      <w:rPr>
-        <w:sz w:val="14"/>
-        <w:szCs w:val="14"/>
-      </w:rPr>
-      <w:fldChar w:fldCharType="separate"/>
-    </w:r>
-    <w:r>
-      <w:rPr>
-        <w:noProof/>
-        <w:sz w:val="14"/>
-        <w:szCs w:val="14"/>
-      </w:rPr>
-      <w:t>2</w:t>
-    </w:r>
-    <w:r>
-      <w:rPr>
-        <w:sz w:val="14"/>
-        <w:szCs w:val="14"/>
-      </w:rPr>
-      <w:fldChar w:fldCharType="end"/>
-    </w:r>
   </w:p>
 </w:ftr>
 </file>
@@ -4425,147 +4591,6 @@
 </w:hdr>
 </file>
 
-<file path=word/header2.xml><?xml version="1.0" encoding="utf-8"?>
-<w:hdr xmlns:wpc="http://schemas.microsoft.com/office/word/2010/wordprocessingCanvas" xmlns:mc="http://schemas.openxmlformats.org/markup-compatibility/2006" xmlns:o="urn:schemas-microsoft-com:office:office" xmlns:r="http://schemas.openxmlformats.org/officeDocument/2006/relationships" xmlns:m="http://schemas.openxmlformats.org/officeDocument/2006/math" xmlns:v="urn:schemas-microsoft-com:vml" xmlns:wp14="http://schemas.microsoft.com/office/word/2010/wordprocessingDrawing" xmlns:wp="http://schemas.openxmlformats.org/drawingml/2006/wordprocessingDrawing" xmlns:w10="urn:schemas-microsoft-com:office:word" xmlns:w="http://schemas.openxmlformats.org/wordprocessingml/2006/main" xmlns:w14="http://schemas.microsoft.com/office/word/2010/wordml" xmlns:w15="http://schemas.microsoft.com/office/word/2012/wordml" xmlns:wpg="http://schemas.microsoft.com/office/word/2010/wordprocessingGroup" xmlns:wpi="http://schemas.microsoft.com/office/word/2010/wordprocessingInk" xmlns:wne="http://schemas.microsoft.com/office/word/2006/wordml" xmlns:wps="http://schemas.microsoft.com/office/word/2010/wordprocessingShape" mc:Ignorable="w14 w15 wp14">
-  <w:p>
-    <w:pPr>
-      <w:pStyle w:val="Encabezado"/>
-      <w:jc w:val="right"/>
-      <w:rPr>
-        <w:rFonts w:ascii="Arial Narrow" w:hAnsi="Arial Narrow"/>
-        <w:b/>
-        <w:bCs/>
-        <w:sz w:val="18"/>
-        <w:szCs w:val="18"/>
-        <w:lang w:val="es-ES"/>
-      </w:rPr>
-    </w:pPr>
-    <w:r>
-      <w:rPr>
-        <w:rFonts w:ascii="Arial Narrow" w:eastAsia="Times New Roman" w:hAnsi="Arial Narrow" w:cs="Times New Roman"/>
-        <w:noProof/>
-        <w:color w:val="000000"/>
-        <w:sz w:val="24"/>
-        <w:szCs w:val="24"/>
-        <w:bdr w:val="none" w:sz="0" w:space="0" w:color="auto" w:frame="1"/>
-        <w:lang w:eastAsia="es-EC"/>
-      </w:rPr>
-      <w:drawing>
-        <wp:anchor distT="0" distB="0" distL="114300" distR="114300" simplePos="0" relativeHeight="251661312" behindDoc="0" locked="0" layoutInCell="1" allowOverlap="1" wp14:anchorId="511B9FA8" wp14:editId="5C346F2F">
-          <wp:simplePos x="0" y="0"/>
-          <wp:positionH relativeFrom="column">
-            <wp:posOffset>-419100</wp:posOffset>
-          </wp:positionH>
-          <wp:positionV relativeFrom="paragraph">
-            <wp:posOffset>-107315</wp:posOffset>
-          </wp:positionV>
-          <wp:extent cx="1073150" cy="307921"/>
-          <wp:effectExtent l="0" t="0" r="0" b="0"/>
-          <wp:wrapNone/>
-          <wp:docPr id="2" name="Picture 1"/>
-          <wp:cNvGraphicFramePr>
-            <a:graphicFrameLocks xmlns:a="http://schemas.openxmlformats.org/drawingml/2006/main" noChangeAspect="1"/>
-          </wp:cNvGraphicFramePr>
-          <a:graphic xmlns:a="http://schemas.openxmlformats.org/drawingml/2006/main">
-            <a:graphicData uri="http://schemas.openxmlformats.org/drawingml/2006/picture">
-              <pic:pic xmlns:pic="http://schemas.openxmlformats.org/drawingml/2006/picture">
-                <pic:nvPicPr>
-                  <pic:cNvPr id="0" name="Picture 1"/>
-                  <pic:cNvPicPr>
-                    <a:picLocks noChangeAspect="1" noChangeArrowheads="1"/>
-                  </pic:cNvPicPr>
-                </pic:nvPicPr>
-                <pic:blipFill>
-                  <a:blip r:embed="rId1">
-                    <a:extLst>
-                      <a:ext uri="{28A0092B-C50C-407E-A947-70E740481C1C}">
-                        <a14:useLocalDpi xmlns:a14="http://schemas.microsoft.com/office/drawing/2010/main" val="0"/>
-                      </a:ext>
-                    </a:extLst>
-                  </a:blip>
-                  <a:srcRect/>
-                  <a:stretch>
-                    <a:fillRect/>
-                  </a:stretch>
-                </pic:blipFill>
-                <pic:spPr bwMode="auto">
-                  <a:xfrm>
-                    <a:off x="0" y="0"/>
-                    <a:ext cx="1073150" cy="307921"/>
-                  </a:xfrm>
-                  <a:prstGeom prst="rect">
-                    <a:avLst/>
-                  </a:prstGeom>
-                  <a:noFill/>
-                  <a:ln>
-                    <a:noFill/>
-                  </a:ln>
-                </pic:spPr>
-              </pic:pic>
-            </a:graphicData>
-          </a:graphic>
-          <wp14:sizeRelH relativeFrom="margin">
-            <wp14:pctWidth>0</wp14:pctWidth>
-          </wp14:sizeRelH>
-          <wp14:sizeRelV relativeFrom="margin">
-            <wp14:pctHeight>0</wp14:pctHeight>
-          </wp14:sizeRelV>
-        </wp:anchor>
-      </w:drawing>
-    </w:r>
-    <w:r>
-      <w:rPr>
-        <w:rFonts w:ascii="Arial Narrow" w:hAnsi="Arial Narrow"/>
-        <w:sz w:val="18"/>
-        <w:szCs w:val="18"/>
-      </w:rPr>
-      <w:t xml:space="preserve"> </w:t>
-    </w:r>
-    <w:r>
-      <w:rPr>
-        <w:rFonts w:ascii="Arial Narrow" w:hAnsi="Arial Narrow"/>
-        <w:b/>
-        <w:bCs/>
-        <w:sz w:val="18"/>
-        <w:szCs w:val="18"/>
-        <w:lang w:val="es-ES"/>
-      </w:rPr>
-      <w:t xml:space="preserve">Vicerrectorado de Docencia </w:t>
-    </w:r>
-  </w:p>
-  <w:p>
-    <w:pPr>
-      <w:pStyle w:val="Encabezado"/>
-      <w:jc w:val="right"/>
-      <w:rPr>
-        <w:rFonts w:ascii="Arial Narrow" w:hAnsi="Arial Narrow"/>
-        <w:b/>
-        <w:bCs/>
-        <w:sz w:val="18"/>
-        <w:szCs w:val="18"/>
-        <w:lang w:val="es-ES"/>
-      </w:rPr>
-    </w:pPr>
-    <w:r>
-      <w:rPr>
-        <w:rFonts w:ascii="Arial Narrow" w:hAnsi="Arial Narrow"/>
-        <w:b/>
-        <w:bCs/>
-        <w:sz w:val="18"/>
-        <w:szCs w:val="18"/>
-        <w:lang w:val="es-ES"/>
-      </w:rPr>
-      <w:t xml:space="preserve">Unidad de Desarrollo Educativo </w:t>
-    </w:r>
-  </w:p>
-  <w:p>
-    <w:pPr>
-      <w:pStyle w:val="Encabezado"/>
-    </w:pPr>
-  </w:p>
-</w:hdr>
-</file>
-
 <file path=word/numbering.xml><?xml version="1.0" encoding="utf-8"?>
 <w:numbering xmlns:wpc="http://schemas.microsoft.com/office/word/2010/wordprocessingCanvas" xmlns:mc="http://schemas.openxmlformats.org/markup-compatibility/2006" xmlns:o="urn:schemas-microsoft-com:office:office" xmlns:r="http://schemas.openxmlformats.org/officeDocument/2006/relationships" xmlns:m="http://schemas.openxmlformats.org/officeDocument/2006/math" xmlns:v="urn:schemas-microsoft-com:vml" xmlns:wp14="http://schemas.microsoft.com/office/word/2010/wordprocessingDrawing" xmlns:wp="http://schemas.openxmlformats.org/drawingml/2006/wordprocessingDrawing" xmlns:w10="urn:schemas-microsoft-com:office:word" xmlns:w="http://schemas.openxmlformats.org/wordprocessingml/2006/main" xmlns:w14="http://schemas.microsoft.com/office/word/2010/wordml" xmlns:w15="http://schemas.microsoft.com/office/word/2012/wordml" xmlns:wpg="http://schemas.microsoft.com/office/word/2010/wordprocessingGroup" xmlns:wpi="http://schemas.microsoft.com/office/word/2010/wordprocessingInk" xmlns:wne="http://schemas.microsoft.com/office/word/2006/wordml" xmlns:wps="http://schemas.microsoft.com/office/word/2010/wordprocessingShape" mc:Ignorable="w14 w15 wp14">
   <w:abstractNum w:abstractNumId="0" w15:restartNumberingAfterBreak="0">
@@ -5457,6 +5482,119 @@
     </w:lvl>
   </w:abstractNum>
   <w:abstractNum w:abstractNumId="9" w15:restartNumberingAfterBreak="0">
+    <w:nsid w:val="486D2F38"/>
+    <w:multiLevelType w:val="hybridMultilevel"/>
+    <w:tmpl w:val="485438B2"/>
+    <w:lvl w:ilvl="0" w:tplc="300A0001">
+      <w:start w:val="1"/>
+      <w:numFmt w:val="bullet"/>
+      <w:lvlText w:val=""/>
+      <w:lvlJc w:val="left"/>
+      <w:pPr>
+        <w:ind w:left="720" w:hanging="360"/>
+      </w:pPr>
+      <w:rPr>
+        <w:rFonts w:ascii="Symbol" w:hAnsi="Symbol" w:hint="default"/>
+      </w:rPr>
+    </w:lvl>
+    <w:lvl w:ilvl="1" w:tplc="300A0003" w:tentative="1">
+      <w:start w:val="1"/>
+      <w:numFmt w:val="bullet"/>
+      <w:lvlText w:val="o"/>
+      <w:lvlJc w:val="left"/>
+      <w:pPr>
+        <w:ind w:left="1440" w:hanging="360"/>
+      </w:pPr>
+      <w:rPr>
+        <w:rFonts w:ascii="Courier New" w:hAnsi="Courier New" w:cs="Courier New" w:hint="default"/>
+      </w:rPr>
+    </w:lvl>
+    <w:lvl w:ilvl="2" w:tplc="300A0005" w:tentative="1">
+      <w:start w:val="1"/>
+      <w:numFmt w:val="bullet"/>
+      <w:lvlText w:val=""/>
+      <w:lvlJc w:val="left"/>
+      <w:pPr>
+        <w:ind w:left="2160" w:hanging="360"/>
+      </w:pPr>
+      <w:rPr>
+        <w:rFonts w:ascii="Wingdings" w:hAnsi="Wingdings" w:hint="default"/>
+      </w:rPr>
+    </w:lvl>
+    <w:lvl w:ilvl="3" w:tplc="300A0001" w:tentative="1">
+      <w:start w:val="1"/>
+      <w:numFmt w:val="bullet"/>
+      <w:lvlText w:val=""/>
+      <w:lvlJc w:val="left"/>
+      <w:pPr>
+        <w:ind w:left="2880" w:hanging="360"/>
+      </w:pPr>
+      <w:rPr>
+        <w:rFonts w:ascii="Symbol" w:hAnsi="Symbol" w:hint="default"/>
+      </w:rPr>
+    </w:lvl>
+    <w:lvl w:ilvl="4" w:tplc="300A0003" w:tentative="1">
+      <w:start w:val="1"/>
+      <w:numFmt w:val="bullet"/>
+      <w:lvlText w:val="o"/>
+      <w:lvlJc w:val="left"/>
+      <w:pPr>
+        <w:ind w:left="3600" w:hanging="360"/>
+      </w:pPr>
+      <w:rPr>
+        <w:rFonts w:ascii="Courier New" w:hAnsi="Courier New" w:cs="Courier New" w:hint="default"/>
+      </w:rPr>
+    </w:lvl>
+    <w:lvl w:ilvl="5" w:tplc="300A0005" w:tentative="1">
+      <w:start w:val="1"/>
+      <w:numFmt w:val="bullet"/>
+      <w:lvlText w:val=""/>
+      <w:lvlJc w:val="left"/>
+      <w:pPr>
+        <w:ind w:left="4320" w:hanging="360"/>
+      </w:pPr>
+      <w:rPr>
+        <w:rFonts w:ascii="Wingdings" w:hAnsi="Wingdings" w:hint="default"/>
+      </w:rPr>
+    </w:lvl>
+    <w:lvl w:ilvl="6" w:tplc="300A0001" w:tentative="1">
+      <w:start w:val="1"/>
+      <w:numFmt w:val="bullet"/>
+      <w:lvlText w:val=""/>
+      <w:lvlJc w:val="left"/>
+      <w:pPr>
+        <w:ind w:left="5040" w:hanging="360"/>
+      </w:pPr>
+      <w:rPr>
+        <w:rFonts w:ascii="Symbol" w:hAnsi="Symbol" w:hint="default"/>
+      </w:rPr>
+    </w:lvl>
+    <w:lvl w:ilvl="7" w:tplc="300A0003" w:tentative="1">
+      <w:start w:val="1"/>
+      <w:numFmt w:val="bullet"/>
+      <w:lvlText w:val="o"/>
+      <w:lvlJc w:val="left"/>
+      <w:pPr>
+        <w:ind w:left="5760" w:hanging="360"/>
+      </w:pPr>
+      <w:rPr>
+        <w:rFonts w:ascii="Courier New" w:hAnsi="Courier New" w:cs="Courier New" w:hint="default"/>
+      </w:rPr>
+    </w:lvl>
+    <w:lvl w:ilvl="8" w:tplc="300A0005" w:tentative="1">
+      <w:start w:val="1"/>
+      <w:numFmt w:val="bullet"/>
+      <w:lvlText w:val=""/>
+      <w:lvlJc w:val="left"/>
+      <w:pPr>
+        <w:ind w:left="6480" w:hanging="360"/>
+      </w:pPr>
+      <w:rPr>
+        <w:rFonts w:ascii="Wingdings" w:hAnsi="Wingdings" w:hint="default"/>
+      </w:rPr>
+    </w:lvl>
+  </w:abstractNum>
+  <w:abstractNum w:abstractNumId="10" w15:restartNumberingAfterBreak="0">
     <w:nsid w:val="4E6C3926"/>
     <w:multiLevelType w:val="hybridMultilevel"/>
     <w:tmpl w:val="39C4A556"/>
@@ -5569,7 +5707,7 @@
       </w:rPr>
     </w:lvl>
   </w:abstractNum>
-  <w:abstractNum w:abstractNumId="10" w15:restartNumberingAfterBreak="0">
+  <w:abstractNum w:abstractNumId="11" w15:restartNumberingAfterBreak="0">
     <w:nsid w:val="508E190C"/>
     <w:multiLevelType w:val="multilevel"/>
     <w:tmpl w:val="A53A4EE2"/>
@@ -5682,7 +5820,7 @@
       </w:rPr>
     </w:lvl>
   </w:abstractNum>
-  <w:abstractNum w:abstractNumId="11" w15:restartNumberingAfterBreak="0">
+  <w:abstractNum w:abstractNumId="12" w15:restartNumberingAfterBreak="0">
     <w:nsid w:val="56512F96"/>
     <w:multiLevelType w:val="hybridMultilevel"/>
     <w:tmpl w:val="15B042B8"/>
@@ -5794,7 +5932,7 @@
       </w:rPr>
     </w:lvl>
   </w:abstractNum>
-  <w:abstractNum w:abstractNumId="12" w15:restartNumberingAfterBreak="0">
+  <w:abstractNum w:abstractNumId="13" w15:restartNumberingAfterBreak="0">
     <w:nsid w:val="578F3E44"/>
     <w:multiLevelType w:val="hybridMultilevel"/>
     <w:tmpl w:val="012664A6"/>
@@ -5907,7 +6045,7 @@
       </w:rPr>
     </w:lvl>
   </w:abstractNum>
-  <w:abstractNum w:abstractNumId="13" w15:restartNumberingAfterBreak="0">
+  <w:abstractNum w:abstractNumId="14" w15:restartNumberingAfterBreak="0">
     <w:nsid w:val="60B53EAF"/>
     <w:multiLevelType w:val="multilevel"/>
     <w:tmpl w:val="1CA66A48"/>
@@ -5996,7 +6134,7 @@
       </w:pPr>
     </w:lvl>
   </w:abstractNum>
-  <w:abstractNum w:abstractNumId="14" w15:restartNumberingAfterBreak="0">
+  <w:abstractNum w:abstractNumId="15" w15:restartNumberingAfterBreak="0">
     <w:nsid w:val="681D6FF7"/>
     <w:multiLevelType w:val="hybridMultilevel"/>
     <w:tmpl w:val="27704D70"/>
@@ -6109,7 +6247,7 @@
       </w:rPr>
     </w:lvl>
   </w:abstractNum>
-  <w:abstractNum w:abstractNumId="15" w15:restartNumberingAfterBreak="0">
+  <w:abstractNum w:abstractNumId="16" w15:restartNumberingAfterBreak="0">
     <w:nsid w:val="6AC257C7"/>
     <w:multiLevelType w:val="hybridMultilevel"/>
     <w:tmpl w:val="644E7038"/>
@@ -6222,7 +6360,7 @@
       </w:rPr>
     </w:lvl>
   </w:abstractNum>
-  <w:abstractNum w:abstractNumId="16" w15:restartNumberingAfterBreak="0">
+  <w:abstractNum w:abstractNumId="17" w15:restartNumberingAfterBreak="0">
     <w:nsid w:val="76E91550"/>
     <w:multiLevelType w:val="multilevel"/>
     <w:tmpl w:val="A8FEA182"/>
@@ -6335,7 +6473,7 @@
       </w:rPr>
     </w:lvl>
   </w:abstractNum>
-  <w:abstractNum w:abstractNumId="17" w15:restartNumberingAfterBreak="0">
+  <w:abstractNum w:abstractNumId="18" w15:restartNumberingAfterBreak="0">
     <w:nsid w:val="7B5422BF"/>
     <w:multiLevelType w:val="hybridMultilevel"/>
     <w:tmpl w:val="4FBC3FB6"/>
@@ -6448,7 +6586,7 @@
       </w:rPr>
     </w:lvl>
   </w:abstractNum>
-  <w:abstractNum w:abstractNumId="18" w15:restartNumberingAfterBreak="0">
+  <w:abstractNum w:abstractNumId="19" w15:restartNumberingAfterBreak="0">
     <w:nsid w:val="7F286D24"/>
     <w:multiLevelType w:val="multilevel"/>
     <w:tmpl w:val="FB28CEBC"/>
@@ -6538,43 +6676,43 @@
     <w:abstractNumId w:val="2"/>
   </w:num>
   <w:num w:numId="2">
-    <w:abstractNumId w:val="13"/>
+    <w:abstractNumId w:val="14"/>
   </w:num>
   <w:num w:numId="3">
     <w:abstractNumId w:val="1"/>
   </w:num>
   <w:num w:numId="4">
-    <w:abstractNumId w:val="11"/>
+    <w:abstractNumId w:val="12"/>
   </w:num>
   <w:num w:numId="5">
     <w:abstractNumId w:val="7"/>
   </w:num>
   <w:num w:numId="6">
-    <w:abstractNumId w:val="15"/>
+    <w:abstractNumId w:val="16"/>
   </w:num>
   <w:num w:numId="7">
     <w:abstractNumId w:val="6"/>
   </w:num>
   <w:num w:numId="8">
-    <w:abstractNumId w:val="10"/>
+    <w:abstractNumId w:val="11"/>
   </w:num>
   <w:num w:numId="9">
     <w:abstractNumId w:val="0"/>
   </w:num>
   <w:num w:numId="10">
-    <w:abstractNumId w:val="17"/>
+    <w:abstractNumId w:val="18"/>
   </w:num>
   <w:num w:numId="11">
-    <w:abstractNumId w:val="9"/>
+    <w:abstractNumId w:val="10"/>
   </w:num>
   <w:num w:numId="12">
     <w:abstractNumId w:val="8"/>
   </w:num>
   <w:num w:numId="13">
-    <w:abstractNumId w:val="12"/>
+    <w:abstractNumId w:val="13"/>
   </w:num>
   <w:num w:numId="14">
-    <w:abstractNumId w:val="14"/>
+    <w:abstractNumId w:val="15"/>
   </w:num>
   <w:num w:numId="15">
     <w:abstractNumId w:val="3"/>
@@ -6583,13 +6721,16 @@
     <w:abstractNumId w:val="5"/>
   </w:num>
   <w:num w:numId="17">
-    <w:abstractNumId w:val="18"/>
+    <w:abstractNumId w:val="19"/>
   </w:num>
   <w:num w:numId="18">
     <w:abstractNumId w:val="4"/>
   </w:num>
   <w:num w:numId="19">
-    <w:abstractNumId w:val="16"/>
+    <w:abstractNumId w:val="17"/>
+  </w:num>
+  <w:num w:numId="20">
+    <w:abstractNumId w:val="9"/>
   </w:num>
 </w:numbering>
 </file>
@@ -7055,7 +7196,6 @@
     <w:name w:val="Normal (Web)"/>
     <w:basedOn w:val="Normal"/>
     <w:uiPriority w:val="99"/>
-    <w:semiHidden/>
     <w:unhideWhenUsed/>
     <w:rsid w:val="004D7110"/>
     <w:pPr>

</xml_diff>